<commit_message>
Define what the housing unit actually is wherever cage effect is discussed
The documents used "cage effect" throughout without ever saying what the
physical unit is. Isolator_. is the only spatial grouping the metadata
records, and each isolator houses 8 birds (5 in isolator 2) -- it is a
negative-pressure unit whose occupants share litter, water and feed, not a
per-animal cage. The mechanism depends on that: eight birds sharing an
environment for the study duration is why their communities converge.

Adds the definition at the first mention in all four summaries, keeps "cage
effect" as the term since that is the established name in the literature, and
replaces the remaining loose uses of "cage" with "isolator" where a physical
unit is meant. Regenerates the Word version from the updated Markdown.

Co-Authored-By: Claude Opus 5 <noreply@anthropic.com>
</commit_message>
<xml_diff>
--- a/summary_Turkey_45_sample_EN.docx
+++ b/summary_Turkey_45_sample_EN.docx
@@ -619,7 +619,89 @@
     </w:tbl>
     <w:p>
       <w:pPr>
-        <w:pStyle w:val="BodyText"/>
+        <w:pStyle w:val="BlockText"/>
+      </w:pPr>
+      <w:r>
+        <w:rPr>
+          <w:b/>
+        </w:rPr>
+        <w:t xml:space="preserve">What an isolator is</w:t>
+      </w:r>
+      <w:r>
+        <w:t xml:space="preserve">: a negative-pressure housing unit used in avian influenza work, separately ventilated to block aerosol transmission between groups.</w:t>
+      </w:r>
+      <w:r>
+        <w:t xml:space="preserve"> </w:t>
+      </w:r>
+      <w:r>
+        <w:rPr>
+          <w:b/>
+        </w:rPr>
+        <w:t xml:space="preserve">Each isolator in this cohort holds 8 birds</w:t>
+      </w:r>
+      <w:r>
+        <w:t xml:space="preserve"> </w:t>
+      </w:r>
+      <w:r>
+        <w:t xml:space="preserve">(5 in isolator 2) — this is not one bird per cage; the whole group shares the same litter, water and feed.</w:t>
+      </w:r>
+      <w:r>
+        <w:t xml:space="preserve"> </w:t>
+      </w:r>
+      <w:r>
+        <w:rPr>
+          <w:rStyle w:val="VerbatimChar"/>
+        </w:rPr>
+        <w:t xml:space="preserve">Isolator_.</w:t>
+      </w:r>
+      <w:r>
+        <w:t xml:space="preserve"> </w:t>
+      </w:r>
+      <w:r>
+        <w:t xml:space="preserve">is the only spatial grouping variable in the metadata; nothing finer is recorded.</w:t>
+      </w:r>
+    </w:p>
+    <w:p>
+      <w:pPr>
+        <w:pStyle w:val="BlockText"/>
+      </w:pPr>
+      <w:r>
+        <w:t xml:space="preserve">The term</w:t>
+      </w:r>
+      <w:r>
+        <w:t xml:space="preserve"> </w:t>
+      </w:r>
+      <w:r>
+        <w:t xml:space="preserve">“</w:t>
+      </w:r>
+      <w:r>
+        <w:t xml:space="preserve">cage effect</w:t>
+      </w:r>
+      <w:r>
+        <w:t xml:space="preserve">”</w:t>
+      </w:r>
+      <w:r>
+        <w:t xml:space="preserve"> </w:t>
+      </w:r>
+      <w:r>
+        <w:t xml:space="preserve">is used below because that is the established name in the literature (from the classic observation that co-housed mice converge microbially), but note that the physical unit here is an isolator, not a cage —</w:t>
+      </w:r>
+      <w:r>
+        <w:t xml:space="preserve"> </w:t>
+      </w:r>
+      <w:r>
+        <w:rPr>
+          <w:b/>
+        </w:rPr>
+        <w:t xml:space="preserve">what is shared is the environmental microbial pool, not the container</w:t>
+      </w:r>
+      <w:r>
+        <w:t xml:space="preserve">.</w:t>
+      </w:r>
+    </w:p>
+    <w:p>
+      <w:pPr>
+        <w:pStyle w:val="FirstParagraph"/>
       </w:pPr>
       <w:r>
         <w:rPr>
@@ -631,7 +713,7 @@
         <w:t xml:space="preserve"> </w:t>
       </w:r>
       <w:r>
-        <w:t xml:space="preserve">That follows from the experimental design (controls and infected birds must be housed separately to prevent cross-infection), but the price is that</w:t>
+        <w:t xml:space="preserve">That follows from the experimental design (controls and infected birds must be housed in separate isolators to prevent cross-infection), but the price is that</w:t>
       </w:r>
       <w:r>
         <w:t xml:space="preserve"> </w:t>
@@ -646,7 +728,7 @@
         <w:t xml:space="preserve"> </w:t>
       </w:r>
       <w:r>
-        <w:t xml:space="preserve">— no sample exists in a cage containing both positives and negatives to break the pattern.</w:t>
+        <w:t xml:space="preserve">— no sample exists in an isolator containing both positives and negatives to break the pattern.</w:t>
       </w:r>
     </w:p>
     <w:p>

</xml_diff>